<commit_message>
Add a non-technical hook slide and split the pipeline/threats slide for Gate 2
Adds a plain-English badge/guard-analogy slide right after the Index for
non-technical stakeholders, and splits the dense "Proposed Technical
Solution" slide into a dedicated pipeline slide (with icons, connectors,
and a worked example) and a dedicated T1-T7 threats slide, per tutor
feedback that the deck front-loads too much technical density.
</commit_message>
<xml_diff>
--- a/slides/GATE-2/GATE-2-Tech Report.docx
+++ b/slides/GATE-2/GATE-2-Tech Report.docx
@@ -122,54 +122,6 @@
           <w:szCs w:val="36"/>
         </w:rPr>
         <w:t>Fauzan Ejaz (Captain)</w:t>
-      </w:r>
-    </w:p>
-    <w:p>
-      <w:pPr>
-        <w:pStyle w:val="ListParagraph"/>
-        <w:numPr>
-          <w:ilvl w:val="0"/>
-          <w:numId w:val="10"/>
-        </w:numPr>
-        <w:rPr>
-          <w:color w:val="555555"/>
-          <w:sz w:val="36"/>
-          <w:szCs w:val="36"/>
-          <w:lang w:val="it-IT"/>
-        </w:rPr>
-      </w:pPr>
-      <w:r>
-        <w:rPr>
-          <w:color w:val="555555"/>
-          <w:sz w:val="36"/>
-          <w:szCs w:val="36"/>
-          <w:lang w:val="it-IT"/>
-        </w:rPr>
-        <w:t>Adithya Zacharia Valavi</w:t>
-      </w:r>
-    </w:p>
-    <w:p>
-      <w:pPr>
-        <w:pStyle w:val="ListParagraph"/>
-        <w:numPr>
-          <w:ilvl w:val="0"/>
-          <w:numId w:val="10"/>
-        </w:numPr>
-        <w:rPr>
-          <w:color w:val="555555"/>
-          <w:sz w:val="36"/>
-          <w:szCs w:val="36"/>
-          <w:lang w:val="it-IT"/>
-        </w:rPr>
-      </w:pPr>
-      <w:r>
-        <w:rPr>
-          <w:color w:val="555555"/>
-          <w:sz w:val="36"/>
-          <w:szCs w:val="36"/>
-          <w:lang w:val="it-IT"/>
-        </w:rPr>
-        <w:t>Ghazanfar Anees Siddiqui</w:t>
       </w:r>
     </w:p>
     <w:p>
@@ -668,15 +620,12 @@
     <w:p/>
     <w:p>
       <w:r>
-        <w:rPr>
-          <w:b w:val="0"/>
-        </w:rPr>
+        <w:lastRenderedPageBreak/>
         <w:t>The gap, the solution, and the state of the art, in one place. The gap: a credential check proves you have the right token, once, at the door - it never asks whether the traffic behind that token still behaves like the agent it claims to be, so a stolen or misused identity passes every time. Our solution: a behavioural fingerprint per agent, scored continuously through the observe / fingerprint / score / decide pipeline above. Against the state of the art: a named, reimplemented Statistical Process Control baseline scores 0.944 ROC-AUC / 63.4% recall on our own data; AEGIS scores 0.965 / 90.7% - a statistically significant gap (p = 0.015), not an assumed one. Full comparison in section 2.4.</w:t>
       </w:r>
     </w:p>
     <w:p>
       <w:r>
-        <w:lastRenderedPageBreak/>
         <w:t>This directly extends the Gate 1 feasibility case: the technology (behavioural fingerprinting and anomaly detection), the risks, and the economic rationale (enabling safe automation, NIS2/GDPR/EU-AI-Act audit evidence) were validated at Gate 1. Gate 2 delivers the concrete architecture (2.2, with a full system diagram), a working implementation (2.3), and numerical proof that the approach works (2.4), the three things Gate 1 could only describe as intent.</w:t>
       </w:r>
     </w:p>
@@ -1697,15 +1646,7 @@
         <w:pStyle w:val="ListNumber"/>
       </w:pPr>
       <w:r>
-        <w:t xml:space="preserve">Evaluation and iteration: re-scoring after every change surfaced two real bugs, not just tuning cosmetics. First, T3 and T5 are naturally sparse per window; rolling 5-minute accumulators fixed this generically. Second, the initial T2 and T5 attack scenarios both had the injected agent call a Network Function outside its own onboarded scope, indistinguishable from T7 to the rules layer, so both were trivially caught by the scope rule rather than the drift/payload logic they were meant to test. Redesigning </w:t>
-      </w:r>
-      <w:proofErr w:type="gramStart"/>
-      <w:r>
-        <w:t>both to</w:t>
-      </w:r>
-      <w:proofErr w:type="gramEnd"/>
-      <w:r>
-        <w:t xml:space="preserve"> stay within the attacking agent's own scope forced detection to rely on the intended statistical signal, which is the origin of the non-uniform per-threat numbers in 2.4.</w:t>
+        <w:t>Evaluation and iteration: re-scoring after every change surfaced two real bugs, not just tuning cosmetics. First, T3 and T5 are naturally sparse per window; rolling 5-minute accumulators fixed this generically. Second, the initial T2 and T5 attack scenarios both had the injected agent call a Network Function outside its own onboarded scope, indistinguishable from T7 to the rules layer, so both were trivially caught by the scope rule rather than the drift/payload logic they were meant to test. Redesigning both to stay within the attacking agent's own scope forced detection to rely on the intended statistical signal, which is the origin of the non-uniform per-threat numbers in 2.4.</w:t>
       </w:r>
     </w:p>
     <w:p>
@@ -2807,22 +2748,20 @@
         <w:rPr>
           <w:b w:val="0"/>
         </w:rPr>
+        <w:lastRenderedPageBreak/>
         <w:t>State of the Art, Head-to-Head</w:t>
       </w:r>
     </w:p>
     <w:p>
       <w:r>
-        <w:rPr>
-          <w:b w:val="0"/>
-        </w:rPr>
         <w:t>"State of the art" can mean anything unless you name a specific system, describe how it works, and test it on your own data. We did that: Statistical Process Control (SPC), a z-score control-chart detector - the classic baseline this kind of behavioural monitoring descends from. We implemented it ourselves and ran it on the identical train/test split AEGIS is evaluated on - a real head-to-head, not two numbers from two different papers.</w:t>
       </w:r>
     </w:p>
     <w:tbl>
       <w:tblPr>
         <w:tblStyle w:val="TableGrid"/>
-        <w:tblW w:type="auto" w:w="0"/>
-        <w:tblLook w:firstColumn="1" w:firstRow="1" w:lastColumn="0" w:lastRow="0" w:noHBand="0" w:noVBand="1" w:val="04A0"/>
+        <w:tblW w:w="0" w:type="auto"/>
+        <w:tblLook w:val="04A0" w:firstRow="1" w:lastRow="0" w:firstColumn="1" w:lastColumn="0" w:noHBand="0" w:noVBand="1"/>
       </w:tblPr>
       <w:tblGrid>
         <w:gridCol w:w="2880"/>
@@ -2832,8 +2771,8 @@
       <w:tr>
         <w:tc>
           <w:tcPr>
-            <w:tcW w:type="dxa" w:w="2880"/>
-            <w:shd w:fill="1E5A8A"/>
+            <w:tcW w:w="2880" w:type="dxa"/>
+            <w:shd w:val="clear" w:color="auto" w:fill="1E5A8A"/>
           </w:tcPr>
           <w:p>
             <w:r>
@@ -2847,8 +2786,8 @@
         </w:tc>
         <w:tc>
           <w:tcPr>
-            <w:tcW w:type="dxa" w:w="2880"/>
-            <w:shd w:fill="1E5A8A"/>
+            <w:tcW w:w="2880" w:type="dxa"/>
+            <w:shd w:val="clear" w:color="auto" w:fill="1E5A8A"/>
           </w:tcPr>
           <w:p>
             <w:r>
@@ -2862,8 +2801,8 @@
         </w:tc>
         <w:tc>
           <w:tcPr>
-            <w:tcW w:type="dxa" w:w="2880"/>
-            <w:shd w:fill="1E5A8A"/>
+            <w:tcW w:w="2880" w:type="dxa"/>
+            <w:shd w:val="clear" w:color="auto" w:fill="1E5A8A"/>
           </w:tcPr>
           <w:p>
             <w:r>
@@ -2879,7 +2818,7 @@
       <w:tr>
         <w:tc>
           <w:tcPr>
-            <w:tcW w:type="dxa" w:w="2880"/>
+            <w:tcW w:w="2880" w:type="dxa"/>
           </w:tcPr>
           <w:p>
             <w:r>
@@ -2889,7 +2828,7 @@
         </w:tc>
         <w:tc>
           <w:tcPr>
-            <w:tcW w:type="dxa" w:w="2880"/>
+            <w:tcW w:w="2880" w:type="dxa"/>
           </w:tcPr>
           <w:p>
             <w:r>
@@ -2899,7 +2838,7 @@
         </w:tc>
         <w:tc>
           <w:tcPr>
-            <w:tcW w:type="dxa" w:w="2880"/>
+            <w:tcW w:w="2880" w:type="dxa"/>
           </w:tcPr>
           <w:p>
             <w:r>
@@ -2911,7 +2850,7 @@
       <w:tr>
         <w:tc>
           <w:tcPr>
-            <w:tcW w:type="dxa" w:w="2880"/>
+            <w:tcW w:w="2880" w:type="dxa"/>
           </w:tcPr>
           <w:p>
             <w:r>
@@ -2921,7 +2860,7 @@
         </w:tc>
         <w:tc>
           <w:tcPr>
-            <w:tcW w:type="dxa" w:w="2880"/>
+            <w:tcW w:w="2880" w:type="dxa"/>
           </w:tcPr>
           <w:p>
             <w:r>
@@ -2931,7 +2870,7 @@
         </w:tc>
         <w:tc>
           <w:tcPr>
-            <w:tcW w:type="dxa" w:w="2880"/>
+            <w:tcW w:w="2880" w:type="dxa"/>
           </w:tcPr>
           <w:p>
             <w:r>
@@ -2944,9 +2883,6 @@
     <w:p/>
     <w:p>
       <w:r>
-        <w:rPr>
-          <w:b w:val="0"/>
-        </w:rPr>
         <w:t>The improvement is statistically significant: a paired bootstrap on the AUC difference gives p = 0.015 (95% CI on the difference: [0.004, 0.040], excluding zero). Per-threat, SPC catches loud, single-feature deviations well (T4 100%, T1 94%) but is structurally blind to threats with no single-feature signature - T2 compromise (21%), T3 recon (27%), T6 sequence (51%) - because it has no notion of scope, sequence, or cross-window behaviour. That gap is the measured case for AEGIS's fingerprinting-plus-fusion approach, not an assumed architectural preference.</w:t>
       </w:r>
     </w:p>
@@ -2963,9 +2899,6 @@
     </w:p>
     <w:p>
       <w:r>
-        <w:rPr>
-          <w:b w:val="0"/>
-        </w:rPr>
         <w:t>A threshold can only rigorously be called optimal with respect to a stated objective. The Neyman-Pearson lemma defines the true optimum as the likelihood-ratio test that maximises detection subject to a false-alarm cap, which requires knowing the real class-conditional distributions - not available, in production or here. What we can check honestly, for our chosen STEP-UP threshold of 0.60:</w:t>
       </w:r>
     </w:p>
@@ -2974,9 +2907,6 @@
         <w:pStyle w:val="ListBullet"/>
       </w:pPr>
       <w:r>
-        <w:rPr>
-          <w:b w:val="0"/>
-        </w:rPr>
         <w:t>Pareto-efficiency: no single alternative threshold beats it on both recall and false-positive rate simultaneously - zero dominators found by direct search.</w:t>
       </w:r>
     </w:p>
@@ -2985,9 +2915,6 @@
         <w:pStyle w:val="ListBullet"/>
       </w:pPr>
       <w:r>
-        <w:rPr>
-          <w:b w:val="0"/>
-        </w:rPr>
         <w:t>Distance to the achievable frontier: 0.60 sits within 0.2 percentage points of FPR of the empirical Neyman-Pearson-achievable frontier for this risk score (the ROC curve's concave hull) - a small, measured gap attributable to the finite ~11,000-window test set, not a meaningful inefficiency.</w:t>
       </w:r>
     </w:p>
@@ -2996,9 +2923,6 @@
         <w:pStyle w:val="ListBullet"/>
       </w:pPr>
       <w:r>
-        <w:rPr>
-          <w:b w:val="0"/>
-        </w:rPr>
         <w:t>Cost-ratio framing: minimising Cost(t) = r*(1-recall(t)) + FPR(t) for a stated cost ratio r = C(missed attack)/C(false alarm), our operating point is consistent with a cost ratio in roughly the 0.16-0.34 range - a checkable, named claim, not an unqualified "optimal."</w:t>
       </w:r>
     </w:p>
@@ -3015,9 +2939,6 @@
     </w:p>
     <w:p>
       <w:r>
-        <w:rPr>
-          <w:b w:val="0"/>
-        </w:rPr>
         <w:t>Full detail for each check below is in reports/GATE-2/, one file per analysis.</w:t>
       </w:r>
     </w:p>
@@ -3026,9 +2947,6 @@
         <w:pStyle w:val="ListBullet"/>
       </w:pPr>
       <w:r>
-        <w:rPr>
-          <w:b w:val="0"/>
-        </w:rPr>
         <w:t>Bootstrap confidence intervals (3,000 replicates): ROC-AUC 0.965 [0.951, 0.977], recall 90.7% [87.6%, 93.5%], FPR 1.43% [1.21%, 1.64%].</w:t>
       </w:r>
     </w:p>
@@ -3037,9 +2955,6 @@
         <w:pStyle w:val="ListBullet"/>
       </w:pPr>
       <w:r>
-        <w:rPr>
-          <w:b w:val="0"/>
-        </w:rPr>
         <w:t>Cross-validated threshold stability: 5-fold CV threshold 0.600 +/- 0.033, recall 90.4% +/- 5.0% - confirms 0.60 was not cherry-picked to one test set.</w:t>
       </w:r>
     </w:p>
@@ -3048,9 +2963,7 @@
         <w:pStyle w:val="ListBullet"/>
       </w:pPr>
       <w:r>
-        <w:rPr>
-          <w:b w:val="0"/>
-        </w:rPr>
+        <w:lastRenderedPageBreak/>
         <w:t>Temporal split robustness: a strict chronological (not random) train/test split gives ROC-AUC 0.969, recall 90.1% - held up despite far less training data.</w:t>
       </w:r>
     </w:p>
@@ -3059,9 +2972,6 @@
         <w:pStyle w:val="ListBullet"/>
       </w:pPr>
       <w:r>
-        <w:rPr>
-          <w:b w:val="0"/>
-        </w:rPr>
         <w:t>Concept-drift check: KS-tests (FDR-corrected) find 6 of 20 agent/feature pairs drift even within 5 synthetic days - motivating a periodic re-baselining cadence as an explicit Gate 3 requirement.</w:t>
       </w:r>
     </w:p>
@@ -3070,19 +2980,10 @@
         <w:pStyle w:val="ListBullet"/>
       </w:pPr>
       <w:r>
-        <w:rPr>
-          <w:b w:val="0"/>
-        </w:rPr>
         <w:t>Adversarial evasion stress test: pacing the same T4 flood volume over 24 hours instead of 1 drops detection 100% to 0% - a real, demonstrated gap, with the fix (a rolling volumetric accumulator, mirroring T3/T5) now a named Gate 3 priority.</w:t>
       </w:r>
     </w:p>
-    <w:p>
-      <w:r>
-        <w:rPr>
-          <w:b w:val="0"/>
-        </w:rPr>
-      </w:r>
-    </w:p>
+    <w:p/>
     <w:p>
       <w:pPr>
         <w:pStyle w:val="Heading1"/>
@@ -3091,7 +2992,6 @@
         <w:rPr>
           <w:color w:val="0B1F3A"/>
         </w:rPr>
-        <w:lastRenderedPageBreak/>
         <w:t>2.5 Expected Proof of Concept (PoC)</w:t>
       </w:r>
     </w:p>
@@ -3119,8 +3019,8 @@
         <w:tblLook w:val="04A0" w:firstRow="1" w:lastRow="0" w:firstColumn="1" w:lastColumn="0" w:noHBand="0" w:noVBand="1"/>
       </w:tblPr>
       <w:tblGrid>
-        <w:gridCol w:w="6317"/>
-        <w:gridCol w:w="2539"/>
+        <w:gridCol w:w="6316"/>
+        <w:gridCol w:w="2540"/>
       </w:tblGrid>
       <w:tr>
         <w:trPr>

</xml_diff>